<commit_message>
feat: complete Week 5 Capstone comprehensive project report, strategic recommendations, and docs
</commit_message>
<xml_diff>
--- a/week4/Week4_ML_Report.docx
+++ b/week4/Week4_ML_Report.docx
@@ -1,6 +1,6 @@
 
 <file path=word/document.xml><?xml version="1.0" encoding="utf-8"?>
-<w:document xmlns:wpc="http://schemas.microsoft.com/office/word/2010/wordprocessingCanvas" xmlns:mo="http://schemas.microsoft.com/office/mac/office/2008/main" xmlns:mc="http://schemas.openxmlformats.org/markup-compatibility/2006" xmlns:mv="urn:schemas-microsoft-com:mac:vml" xmlns:o="urn:schemas-microsoft-com:office:office" xmlns:r="http://schemas.openxmlformats.org/officeDocument/2006/relationships" xmlns:m="http://schemas.openxmlformats.org/officeDocument/2006/math" xmlns:v="urn:schemas-microsoft-com:vml" xmlns:wp14="http://schemas.microsoft.com/office/word/2010/wordprocessingDrawing" xmlns:wp="http://schemas.openxmlformats.org/drawingml/2006/wordprocessingDrawing" xmlns:w10="urn:schemas-microsoft-com:office:word" xmlns:w="http://schemas.openxmlformats.org/wordprocessingml/2006/main" xmlns:w14="http://schemas.microsoft.com/office/word/2010/wordml" xmlns:wpg="http://schemas.microsoft.com/office/word/2010/wordprocessingGroup" xmlns:wpi="http://schemas.microsoft.com/office/word/2010/wordprocessingInk" xmlns:wne="http://schemas.microsoft.com/office/word/2006/wordml" xmlns:wps="http://schemas.microsoft.com/office/word/2010/wordprocessingShape" mc:Ignorable="w14 wp14">
+<w:document xmlns:ve="http://schemas.openxmlformats.org/markup-compatibility/2006" xmlns:o="urn:schemas-microsoft-com:office:office" xmlns:r="http://schemas.openxmlformats.org/officeDocument/2006/relationships" xmlns:m="http://schemas.openxmlformats.org/officeDocument/2006/math" xmlns:v="urn:schemas-microsoft-com:vml" xmlns:wp="http://schemas.openxmlformats.org/drawingml/2006/wordprocessingDrawing" xmlns:w10="urn:schemas-microsoft-com:office:word" xmlns:w="http://schemas.openxmlformats.org/wordprocessingml/2006/main" xmlns:wne="http://schemas.microsoft.com/office/word/2006/wordml">
   <w:body>
     <w:p>
       <w:pPr>
@@ -13,6 +13,13 @@
           <w:sz w:val="40"/>
         </w:rPr>
         <w:t>Week 4: Machine Learning Model Development &amp; Evaluation</w:t>
+      </w:r>
+      <w:r>
+        <w:rPr>
+          <w:b/>
+          <w:color w:val="1A5276"/>
+          <w:sz w:val="40"/>
+        </w:rPr>
         <w:br/>
       </w:r>
       <w:r>
@@ -22,38 +29,14 @@
           <w:sz w:val="24"/>
         </w:rPr>
         <w:t>Predictive Modeling and Statistical Validation on the World Happiness Index</w:t>
-        <w:br/>
       </w:r>
       <w:r>
         <w:rPr>
-          <w:color w:val="808080"/>
-          <w:sz w:val="20"/>
+          <w:i/>
+          <w:color w:val="2874A6"/>
+          <w:sz w:val="24"/>
         </w:rPr>
-        <w:t>YUVA Data Analytics Internship | Machine Learning Deliverable</w:t>
-      </w:r>
-    </w:p>
-    <w:p>
-      <w:pPr>
-        <w:spacing w:after="200"/>
-      </w:pPr>
-    </w:p>
-    <w:p>
-      <w:pPr>
-        <w:pStyle w:val="Heading1"/>
-        <w:spacing w:before="280" w:after="120"/>
-      </w:pPr>
-      <w:r>
-        <w:rPr>
-          <w:b/>
-          <w:color w:val="1A5276"/>
-          <w:sz w:val="32"/>
-        </w:rPr>
-        <w:t>1. Executive Summary &amp; Task Objectives</w:t>
-      </w:r>
-    </w:p>
-    <w:p>
-      <w:r>
-        <w:t>Week 4 focuses on designing, training, validating, and critically benchmarking predictive Machine Learning models using the multi-year World Happiness Report dataset. The objective is to construct regression pipelines that predict a nation's Happiness Score based on key socio-economic indicators, rigorously evaluate their generalization capabilities using 5-Fold Cross-Validation, and provide diagnostic assessments of error distributions.</w:t>
+        <w:br/>
       </w:r>
     </w:p>
     <w:p>
@@ -63,7 +46,30 @@
       </w:pPr>
       <w:r>
         <w:rPr>
-          <w:b/>
+          <w:color w:val="1A5276"/>
+          <w:sz w:val="32"/>
+        </w:rPr>
+        <w:t>1. Executive Summary &amp; Task Objectives</w:t>
+      </w:r>
+    </w:p>
+    <w:p>
+      <w:r>
+        <w:t xml:space="preserve">Week 4 focuses on </w:t>
+      </w:r>
+      <w:r>
+        <w:t>designing, training, validating, and critically benchmarking predictive Machine Learning models using the multi-year World Happiness Report dataset. The objective is to construct regression pipelines that predict a nation's Happiness Score based on key soc</w:t>
+      </w:r>
+      <w:r>
+        <w:t>io-economic indicators, rigorously evaluate their generalization capabilities using 5-Fold Cross-Validation, and provide diagnostic assessments of error distributions.</w:t>
+      </w:r>
+    </w:p>
+    <w:p>
+      <w:pPr>
+        <w:pStyle w:val="Heading1"/>
+        <w:spacing w:before="280" w:after="120"/>
+      </w:pPr>
+      <w:r>
+        <w:rPr>
           <w:color w:val="1A5276"/>
           <w:sz w:val="32"/>
         </w:rPr>
@@ -72,7 +78,10 @@
     </w:p>
     <w:p>
       <w:r>
-        <w:t>Data preprocessing was performed to ensure statistical validity and prevent data leakage across model partitions:</w:t>
+        <w:t>Data preprocessing was performed to</w:t>
+      </w:r>
+      <w:r>
+        <w:t xml:space="preserve"> ensure statistical validity and prevent data leakage across model partitions:</w:t>
       </w:r>
     </w:p>
     <w:p>
@@ -86,7 +95,10 @@
         <w:t xml:space="preserve">Feature Selection: </w:t>
       </w:r>
       <w:r>
-        <w:t>Six core socio-economic dimensions were extracted as predictor variables (X): Economy (GDP per Capita), Social Support (Family), Health (Life Expectancy), Freedom to Make Choices, Perceptions of Government Corruption (Trust), and Generosity.</w:t>
+        <w:t>Six core socio-economic dimensions were extracted as predictor variables (X): Economy (GDP per Capita), Social Support (Family), Health (Life Expectancy), Fre</w:t>
+      </w:r>
+      <w:r>
+        <w:t>edom to Make Choices, Perceptions of Government Corruption (Trust), and Generosity.</w:t>
       </w:r>
     </w:p>
     <w:p>
@@ -114,7 +126,10 @@
         <w:t xml:space="preserve">Missing Value Treatment: </w:t>
       </w:r>
       <w:r>
-        <w:t>Filtered complete cases across the reporting timeline to avoid distortion from incomplete schema reporting.</w:t>
+        <w:t>Filtered c</w:t>
+      </w:r>
+      <w:r>
+        <w:t>omplete cases across the reporting timeline to avoid distortion from incomplete schema reporting.</w:t>
       </w:r>
     </w:p>
     <w:p>
@@ -128,7 +143,10 @@
         <w:t xml:space="preserve">Data Partitioning: </w:t>
       </w:r>
       <w:r>
-        <w:t>Stratified/shuffled 80/20 train-test split (252 training records, 63 testing records) using a fixed random seed (seed=42) for reproducible benchmarking.</w:t>
+        <w:t xml:space="preserve">Stratified/shuffled 80/20 train-test split (252 training records, 63 testing records) using a fixed random seed (seed=42) for reproducible </w:t>
+      </w:r>
+      <w:r>
+        <w:t>benchmarking.</w:t>
       </w:r>
     </w:p>
     <w:p>
@@ -152,7 +170,6 @@
       </w:pPr>
       <w:r>
         <w:rPr>
-          <w:b/>
           <w:color w:val="1A5276"/>
           <w:sz w:val="32"/>
         </w:rPr>
@@ -161,7 +178,10 @@
     </w:p>
     <w:p>
       <w:r>
-        <w:t>To comprehensively evaluate linear and non-linear patterns, five distinct algorithms were trained and compared:</w:t>
+        <w:t xml:space="preserve">To comprehensively evaluate </w:t>
+      </w:r>
+      <w:r>
+        <w:t>linear and non-linear patterns, five distinct algorithms were trained and compared:</w:t>
       </w:r>
     </w:p>
     <w:p>
@@ -186,7 +206,13 @@
         <w:rPr>
           <w:b/>
         </w:rPr>
-        <w:t xml:space="preserve">2. Ridge Regression (L2 Regularization): </w:t>
+        <w:t>2. Ridge Regre</w:t>
+      </w:r>
+      <w:r>
+        <w:rPr>
+          <w:b/>
+        </w:rPr>
+        <w:t xml:space="preserve">ssion (L2 Regularization): </w:t>
       </w:r>
       <w:r>
         <w:t>Introduces an L2 penalty on regression weights (alpha=1.0) to stabilize estimates against multicollinearity between GDP and Life Expectancy.</w:t>
@@ -203,7 +229,10 @@
         <w:t xml:space="preserve">3. Decision Tree Regressor: </w:t>
       </w:r>
       <w:r>
-        <w:t>Non-parametric tree-based partitioner capable of capturing step-wise interactions, constrained with a max_depth=5 to mitigate overfitting.</w:t>
+        <w:t>Non-parametric tree-based partitioner capable of capturing s</w:t>
+      </w:r>
+      <w:r>
+        <w:t>tep-wise interactions, constrained with a max_depth=5 to mitigate overfitting.</w:t>
       </w:r>
     </w:p>
     <w:p>
@@ -214,6 +243,7 @@
         <w:rPr>
           <w:b/>
         </w:rPr>
+        <w:lastRenderedPageBreak/>
         <w:t xml:space="preserve">4. Random Forest Regressor: </w:t>
       </w:r>
       <w:r>
@@ -228,7 +258,13 @@
         <w:rPr>
           <w:b/>
         </w:rPr>
-        <w:t xml:space="preserve">5. Gradient Boosting Regressor: </w:t>
+        <w:t>5. Gradient</w:t>
+      </w:r>
+      <w:r>
+        <w:rPr>
+          <w:b/>
+        </w:rPr>
+        <w:t xml:space="preserve"> Boosting Regressor: </w:t>
       </w:r>
       <w:r>
         <w:t>Sequential ensemble boosting technique optimizing pseudo-residuals with learning_rate=0.08 and 100 estimators.</w:t>
@@ -241,7 +277,6 @@
       </w:pPr>
       <w:r>
         <w:rPr>
-          <w:b/>
           <w:color w:val="1A5276"/>
           <w:sz w:val="32"/>
         </w:rPr>
@@ -250,14 +285,17 @@
     </w:p>
     <w:p>
       <w:r>
-        <w:t>Models were assessed on three standard regression metrics: Mean Absolute Error (MAE), Root Mean Squared Error (RMSE), and Out-of-Sample R² Score, complemented by 5-Fold Cross-Validation R² to gauge generalization stability.</w:t>
+        <w:t>Models were assessed on three standard regression metrics: Mean Absolute Error (</w:t>
+      </w:r>
+      <w:r>
+        <w:t>MAE), Root Mean Squared Error (RMSE), and Out-of-Sample R² Score, complemented by 5-Fold Cross-Validation R² to gauge generalization stability.</w:t>
       </w:r>
     </w:p>
     <w:tbl>
       <w:tblPr>
-        <w:tblW w:type="auto" w:w="0"/>
+        <w:tblW w:w="0" w:type="auto"/>
         <w:jc w:val="center"/>
-        <w:tblLook w:firstColumn="1" w:firstRow="1" w:lastColumn="0" w:lastRow="0" w:noHBand="0" w:noVBand="1" w:val="04A0"/>
+        <w:tblLook w:val="04A0"/>
       </w:tblPr>
       <w:tblGrid>
         <w:gridCol w:w="1872"/>
@@ -267,10 +305,13 @@
         <w:gridCol w:w="1872"/>
       </w:tblGrid>
       <w:tr>
+        <w:trPr>
+          <w:jc w:val="center"/>
+        </w:trPr>
         <w:tc>
           <w:tcPr>
-            <w:tcW w:type="dxa" w:w="1872"/>
-            <w:shd w:fill="1A5276"/>
+            <w:tcW w:w="1872" w:type="dxa"/>
+            <w:shd w:val="clear" w:color="auto" w:fill="1A5276"/>
           </w:tcPr>
           <w:p>
             <w:pPr>
@@ -287,8 +328,8 @@
         </w:tc>
         <w:tc>
           <w:tcPr>
-            <w:tcW w:type="dxa" w:w="1872"/>
-            <w:shd w:fill="1A5276"/>
+            <w:tcW w:w="1872" w:type="dxa"/>
+            <w:shd w:val="clear" w:color="auto" w:fill="1A5276"/>
           </w:tcPr>
           <w:p>
             <w:pPr>
@@ -305,8 +346,8 @@
         </w:tc>
         <w:tc>
           <w:tcPr>
-            <w:tcW w:type="dxa" w:w="1872"/>
-            <w:shd w:fill="1A5276"/>
+            <w:tcW w:w="1872" w:type="dxa"/>
+            <w:shd w:val="clear" w:color="auto" w:fill="1A5276"/>
           </w:tcPr>
           <w:p>
             <w:pPr>
@@ -323,8 +364,8 @@
         </w:tc>
         <w:tc>
           <w:tcPr>
-            <w:tcW w:type="dxa" w:w="1872"/>
-            <w:shd w:fill="1A5276"/>
+            <w:tcW w:w="1872" w:type="dxa"/>
+            <w:shd w:val="clear" w:color="auto" w:fill="1A5276"/>
           </w:tcPr>
           <w:p>
             <w:pPr>
@@ -341,8 +382,8 @@
         </w:tc>
         <w:tc>
           <w:tcPr>
-            <w:tcW w:type="dxa" w:w="1872"/>
-            <w:shd w:fill="1A5276"/>
+            <w:tcW w:w="1872" w:type="dxa"/>
+            <w:shd w:val="clear" w:color="auto" w:fill="1A5276"/>
           </w:tcPr>
           <w:p>
             <w:pPr>
@@ -359,10 +400,13 @@
         </w:tc>
       </w:tr>
       <w:tr>
+        <w:trPr>
+          <w:jc w:val="center"/>
+        </w:trPr>
         <w:tc>
           <w:tcPr>
-            <w:tcW w:type="dxa" w:w="1872"/>
-            <w:shd w:fill="F2F4F4"/>
+            <w:tcW w:w="1872" w:type="dxa"/>
+            <w:shd w:val="clear" w:color="auto" w:fill="F2F4F4"/>
           </w:tcPr>
           <w:p>
             <w:pPr>
@@ -375,8 +419,8 @@
         </w:tc>
         <w:tc>
           <w:tcPr>
-            <w:tcW w:type="dxa" w:w="1872"/>
-            <w:shd w:fill="F2F4F4"/>
+            <w:tcW w:w="1872" w:type="dxa"/>
+            <w:shd w:val="clear" w:color="auto" w:fill="F2F4F4"/>
           </w:tcPr>
           <w:p>
             <w:pPr>
@@ -389,8 +433,8 @@
         </w:tc>
         <w:tc>
           <w:tcPr>
-            <w:tcW w:type="dxa" w:w="1872"/>
-            <w:shd w:fill="F2F4F4"/>
+            <w:tcW w:w="1872" w:type="dxa"/>
+            <w:shd w:val="clear" w:color="auto" w:fill="F2F4F4"/>
           </w:tcPr>
           <w:p>
             <w:pPr>
@@ -403,8 +447,8 @@
         </w:tc>
         <w:tc>
           <w:tcPr>
-            <w:tcW w:type="dxa" w:w="1872"/>
-            <w:shd w:fill="F2F4F4"/>
+            <w:tcW w:w="1872" w:type="dxa"/>
+            <w:shd w:val="clear" w:color="auto" w:fill="F2F4F4"/>
           </w:tcPr>
           <w:p>
             <w:pPr>
@@ -417,8 +461,8 @@
         </w:tc>
         <w:tc>
           <w:tcPr>
-            <w:tcW w:type="dxa" w:w="1872"/>
-            <w:shd w:fill="F2F4F4"/>
+            <w:tcW w:w="1872" w:type="dxa"/>
+            <w:shd w:val="clear" w:color="auto" w:fill="F2F4F4"/>
           </w:tcPr>
           <w:p>
             <w:pPr>
@@ -431,9 +475,12 @@
         </w:tc>
       </w:tr>
       <w:tr>
+        <w:trPr>
+          <w:jc w:val="center"/>
+        </w:trPr>
         <w:tc>
           <w:tcPr>
-            <w:tcW w:type="dxa" w:w="1872"/>
+            <w:tcW w:w="1872" w:type="dxa"/>
           </w:tcPr>
           <w:p>
             <w:pPr>
@@ -446,7 +493,7 @@
         </w:tc>
         <w:tc>
           <w:tcPr>
-            <w:tcW w:type="dxa" w:w="1872"/>
+            <w:tcW w:w="1872" w:type="dxa"/>
           </w:tcPr>
           <w:p>
             <w:pPr>
@@ -459,7 +506,7 @@
         </w:tc>
         <w:tc>
           <w:tcPr>
-            <w:tcW w:type="dxa" w:w="1872"/>
+            <w:tcW w:w="1872" w:type="dxa"/>
           </w:tcPr>
           <w:p>
             <w:pPr>
@@ -472,7 +519,7 @@
         </w:tc>
         <w:tc>
           <w:tcPr>
-            <w:tcW w:type="dxa" w:w="1872"/>
+            <w:tcW w:w="1872" w:type="dxa"/>
           </w:tcPr>
           <w:p>
             <w:pPr>
@@ -485,7 +532,7 @@
         </w:tc>
         <w:tc>
           <w:tcPr>
-            <w:tcW w:type="dxa" w:w="1872"/>
+            <w:tcW w:w="1872" w:type="dxa"/>
           </w:tcPr>
           <w:p>
             <w:pPr>
@@ -498,10 +545,13 @@
         </w:tc>
       </w:tr>
       <w:tr>
+        <w:trPr>
+          <w:jc w:val="center"/>
+        </w:trPr>
         <w:tc>
           <w:tcPr>
-            <w:tcW w:type="dxa" w:w="1872"/>
-            <w:shd w:fill="F2F4F4"/>
+            <w:tcW w:w="1872" w:type="dxa"/>
+            <w:shd w:val="clear" w:color="auto" w:fill="F2F4F4"/>
           </w:tcPr>
           <w:p>
             <w:pPr>
@@ -514,8 +564,8 @@
         </w:tc>
         <w:tc>
           <w:tcPr>
-            <w:tcW w:type="dxa" w:w="1872"/>
-            <w:shd w:fill="F2F4F4"/>
+            <w:tcW w:w="1872" w:type="dxa"/>
+            <w:shd w:val="clear" w:color="auto" w:fill="F2F4F4"/>
           </w:tcPr>
           <w:p>
             <w:pPr>
@@ -528,8 +578,8 @@
         </w:tc>
         <w:tc>
           <w:tcPr>
-            <w:tcW w:type="dxa" w:w="1872"/>
-            <w:shd w:fill="F2F4F4"/>
+            <w:tcW w:w="1872" w:type="dxa"/>
+            <w:shd w:val="clear" w:color="auto" w:fill="F2F4F4"/>
           </w:tcPr>
           <w:p>
             <w:pPr>
@@ -542,8 +592,8 @@
         </w:tc>
         <w:tc>
           <w:tcPr>
-            <w:tcW w:type="dxa" w:w="1872"/>
-            <w:shd w:fill="F2F4F4"/>
+            <w:tcW w:w="1872" w:type="dxa"/>
+            <w:shd w:val="clear" w:color="auto" w:fill="F2F4F4"/>
           </w:tcPr>
           <w:p>
             <w:pPr>
@@ -556,8 +606,8 @@
         </w:tc>
         <w:tc>
           <w:tcPr>
-            <w:tcW w:type="dxa" w:w="1872"/>
-            <w:shd w:fill="F2F4F4"/>
+            <w:tcW w:w="1872" w:type="dxa"/>
+            <w:shd w:val="clear" w:color="auto" w:fill="F2F4F4"/>
           </w:tcPr>
           <w:p>
             <w:pPr>
@@ -570,9 +620,12 @@
         </w:tc>
       </w:tr>
       <w:tr>
+        <w:trPr>
+          <w:jc w:val="center"/>
+        </w:trPr>
         <w:tc>
           <w:tcPr>
-            <w:tcW w:type="dxa" w:w="1872"/>
+            <w:tcW w:w="1872" w:type="dxa"/>
           </w:tcPr>
           <w:p>
             <w:pPr>
@@ -585,7 +638,7 @@
         </w:tc>
         <w:tc>
           <w:tcPr>
-            <w:tcW w:type="dxa" w:w="1872"/>
+            <w:tcW w:w="1872" w:type="dxa"/>
           </w:tcPr>
           <w:p>
             <w:pPr>
@@ -598,7 +651,7 @@
         </w:tc>
         <w:tc>
           <w:tcPr>
-            <w:tcW w:type="dxa" w:w="1872"/>
+            <w:tcW w:w="1872" w:type="dxa"/>
           </w:tcPr>
           <w:p>
             <w:pPr>
@@ -611,7 +664,7 @@
         </w:tc>
         <w:tc>
           <w:tcPr>
-            <w:tcW w:type="dxa" w:w="1872"/>
+            <w:tcW w:w="1872" w:type="dxa"/>
           </w:tcPr>
           <w:p>
             <w:pPr>
@@ -624,7 +677,7 @@
         </w:tc>
         <w:tc>
           <w:tcPr>
-            <w:tcW w:type="dxa" w:w="1872"/>
+            <w:tcW w:w="1872" w:type="dxa"/>
           </w:tcPr>
           <w:p>
             <w:pPr>
@@ -637,10 +690,13 @@
         </w:tc>
       </w:tr>
       <w:tr>
+        <w:trPr>
+          <w:jc w:val="center"/>
+        </w:trPr>
         <w:tc>
           <w:tcPr>
-            <w:tcW w:type="dxa" w:w="1872"/>
-            <w:shd w:fill="F2F4F4"/>
+            <w:tcW w:w="1872" w:type="dxa"/>
+            <w:shd w:val="clear" w:color="auto" w:fill="F2F4F4"/>
           </w:tcPr>
           <w:p>
             <w:pPr>
@@ -653,8 +709,8 @@
         </w:tc>
         <w:tc>
           <w:tcPr>
-            <w:tcW w:type="dxa" w:w="1872"/>
-            <w:shd w:fill="F2F4F4"/>
+            <w:tcW w:w="1872" w:type="dxa"/>
+            <w:shd w:val="clear" w:color="auto" w:fill="F2F4F4"/>
           </w:tcPr>
           <w:p>
             <w:pPr>
@@ -667,8 +723,8 @@
         </w:tc>
         <w:tc>
           <w:tcPr>
-            <w:tcW w:type="dxa" w:w="1872"/>
-            <w:shd w:fill="F2F4F4"/>
+            <w:tcW w:w="1872" w:type="dxa"/>
+            <w:shd w:val="clear" w:color="auto" w:fill="F2F4F4"/>
           </w:tcPr>
           <w:p>
             <w:pPr>
@@ -681,8 +737,8 @@
         </w:tc>
         <w:tc>
           <w:tcPr>
-            <w:tcW w:type="dxa" w:w="1872"/>
-            <w:shd w:fill="F2F4F4"/>
+            <w:tcW w:w="1872" w:type="dxa"/>
+            <w:shd w:val="clear" w:color="auto" w:fill="F2F4F4"/>
           </w:tcPr>
           <w:p>
             <w:pPr>
@@ -695,8 +751,8 @@
         </w:tc>
         <w:tc>
           <w:tcPr>
-            <w:tcW w:type="dxa" w:w="1872"/>
-            <w:shd w:fill="F2F4F4"/>
+            <w:tcW w:w="1872" w:type="dxa"/>
+            <w:shd w:val="clear" w:color="auto" w:fill="F2F4F4"/>
           </w:tcPr>
           <w:p>
             <w:pPr>
@@ -716,16 +772,68 @@
     </w:p>
     <w:p>
       <w:pPr>
+        <w:spacing w:after="160"/>
+      </w:pPr>
+    </w:p>
+    <w:p>
+      <w:pPr>
+        <w:spacing w:after="160"/>
+      </w:pPr>
+    </w:p>
+    <w:p>
+      <w:pPr>
+        <w:spacing w:after="160"/>
+      </w:pPr>
+    </w:p>
+    <w:p>
+      <w:pPr>
+        <w:spacing w:after="160"/>
+      </w:pPr>
+    </w:p>
+    <w:p>
+      <w:pPr>
+        <w:spacing w:after="160"/>
+      </w:pPr>
+    </w:p>
+    <w:p>
+      <w:pPr>
+        <w:spacing w:after="160"/>
+      </w:pPr>
+    </w:p>
+    <w:p>
+      <w:pPr>
+        <w:spacing w:after="160"/>
+      </w:pPr>
+    </w:p>
+    <w:p>
+      <w:pPr>
+        <w:spacing w:after="160"/>
+      </w:pPr>
+    </w:p>
+    <w:p>
+      <w:pPr>
+        <w:spacing w:after="160"/>
+      </w:pPr>
+    </w:p>
+    <w:p>
+      <w:pPr>
         <w:pStyle w:val="Heading1"/>
         <w:spacing w:before="280" w:after="120"/>
       </w:pPr>
       <w:r>
         <w:rPr>
-          <w:b/>
           <w:color w:val="1A5276"/>
           <w:sz w:val="32"/>
         </w:rPr>
-        <w:t>5. Visual Performance Diagnostics</w:t>
+        <w:lastRenderedPageBreak/>
+        <w:t xml:space="preserve">5. Visual Performance </w:t>
+      </w:r>
+      <w:r>
+        <w:rPr>
+          <w:color w:val="1A5276"/>
+          <w:sz w:val="32"/>
+        </w:rPr>
+        <w:t>Diagnostics</w:t>
       </w:r>
     </w:p>
     <w:p>
@@ -735,22 +843,26 @@
     </w:p>
     <w:p>
       <w:r>
+        <w:rPr>
+          <w:noProof/>
+        </w:rPr>
         <w:drawing>
-          <wp:inline xmlns:a="http://schemas.openxmlformats.org/drawingml/2006/main" xmlns:pic="http://schemas.openxmlformats.org/drawingml/2006/picture">
+          <wp:inline distT="0" distB="0" distL="0" distR="0">
             <wp:extent cx="5486400" cy="2743200"/>
+            <wp:effectExtent l="0" t="0" r="0" b="0"/>
             <wp:docPr id="1" name="Picture 1"/>
             <wp:cNvGraphicFramePr>
-              <a:graphicFrameLocks noChangeAspect="1"/>
+              <a:graphicFrameLocks xmlns:a="http://schemas.openxmlformats.org/drawingml/2006/main" noChangeAspect="1"/>
             </wp:cNvGraphicFramePr>
-            <a:graphic>
+            <a:graphic xmlns:a="http://schemas.openxmlformats.org/drawingml/2006/main">
               <a:graphicData uri="http://schemas.openxmlformats.org/drawingml/2006/picture">
-                <pic:pic>
+                <pic:pic xmlns:pic="http://schemas.openxmlformats.org/drawingml/2006/picture">
                   <pic:nvPicPr>
                     <pic:cNvPr id="0" name="viz_model_comparison.png"/>
                     <pic:cNvPicPr/>
                   </pic:nvPicPr>
                   <pic:blipFill>
-                    <a:blip r:embed="rId9"/>
+                    <a:blip r:embed="rId6"/>
                     <a:stretch>
                       <a:fillRect/>
                     </a:stretch>
@@ -760,7 +872,9 @@
                       <a:off x="0" y="0"/>
                       <a:ext cx="5486400" cy="2743200"/>
                     </a:xfrm>
-                    <a:prstGeom prst="rect"/>
+                    <a:prstGeom prst="rect">
+                      <a:avLst/>
+                    </a:prstGeom>
                   </pic:spPr>
                 </pic:pic>
               </a:graphicData>
@@ -788,22 +902,26 @@
     </w:p>
     <w:p>
       <w:r>
+        <w:rPr>
+          <w:noProof/>
+        </w:rPr>
         <w:drawing>
-          <wp:inline xmlns:a="http://schemas.openxmlformats.org/drawingml/2006/main" xmlns:pic="http://schemas.openxmlformats.org/drawingml/2006/picture">
+          <wp:inline distT="0" distB="0" distL="0" distR="0">
             <wp:extent cx="5029200" cy="3771900"/>
+            <wp:effectExtent l="0" t="0" r="0" b="0"/>
             <wp:docPr id="2" name="Picture 2"/>
             <wp:cNvGraphicFramePr>
-              <a:graphicFrameLocks noChangeAspect="1"/>
+              <a:graphicFrameLocks xmlns:a="http://schemas.openxmlformats.org/drawingml/2006/main" noChangeAspect="1"/>
             </wp:cNvGraphicFramePr>
-            <a:graphic>
+            <a:graphic xmlns:a="http://schemas.openxmlformats.org/drawingml/2006/main">
               <a:graphicData uri="http://schemas.openxmlformats.org/drawingml/2006/picture">
-                <pic:pic>
+                <pic:pic xmlns:pic="http://schemas.openxmlformats.org/drawingml/2006/picture">
                   <pic:nvPicPr>
                     <pic:cNvPr id="0" name="viz_actual_vs_predicted.png"/>
                     <pic:cNvPicPr/>
                   </pic:nvPicPr>
                   <pic:blipFill>
-                    <a:blip r:embed="rId10"/>
+                    <a:blip r:embed="rId7"/>
                     <a:stretch>
                       <a:fillRect/>
                     </a:stretch>
@@ -813,7 +931,9 @@
                       <a:off x="0" y="0"/>
                       <a:ext cx="5029200" cy="3771900"/>
                     </a:xfrm>
-                    <a:prstGeom prst="rect"/>
+                    <a:prstGeom prst="rect">
+                      <a:avLst/>
+                    </a:prstGeom>
                   </pic:spPr>
                 </pic:pic>
               </a:graphicData>
@@ -831,6 +951,7 @@
           <w:i/>
           <w:sz w:val="19"/>
         </w:rPr>
+        <w:lastRenderedPageBreak/>
         <w:t>Figure 2: Actual vs. Predicted Happiness Score with Ideal Parity Line (y = x).</w:t>
       </w:r>
     </w:p>
@@ -841,22 +962,26 @@
     </w:p>
     <w:p>
       <w:r>
+        <w:rPr>
+          <w:noProof/>
+        </w:rPr>
         <w:drawing>
-          <wp:inline xmlns:a="http://schemas.openxmlformats.org/drawingml/2006/main" xmlns:pic="http://schemas.openxmlformats.org/drawingml/2006/picture">
+          <wp:inline distT="0" distB="0" distL="0" distR="0">
             <wp:extent cx="5486400" cy="2110154"/>
+            <wp:effectExtent l="0" t="0" r="0" b="0"/>
             <wp:docPr id="3" name="Picture 3"/>
             <wp:cNvGraphicFramePr>
-              <a:graphicFrameLocks noChangeAspect="1"/>
+              <a:graphicFrameLocks xmlns:a="http://schemas.openxmlformats.org/drawingml/2006/main" noChangeAspect="1"/>
             </wp:cNvGraphicFramePr>
-            <a:graphic>
+            <a:graphic xmlns:a="http://schemas.openxmlformats.org/drawingml/2006/main">
               <a:graphicData uri="http://schemas.openxmlformats.org/drawingml/2006/picture">
-                <pic:pic>
+                <pic:pic xmlns:pic="http://schemas.openxmlformats.org/drawingml/2006/picture">
                   <pic:nvPicPr>
                     <pic:cNvPr id="0" name="viz_residuals_analysis.png"/>
                     <pic:cNvPicPr/>
                   </pic:nvPicPr>
                   <pic:blipFill>
-                    <a:blip r:embed="rId11"/>
+                    <a:blip r:embed="rId8"/>
                     <a:stretch>
                       <a:fillRect/>
                     </a:stretch>
@@ -866,7 +991,9 @@
                       <a:off x="0" y="0"/>
                       <a:ext cx="5486400" cy="2110154"/>
                     </a:xfrm>
-                    <a:prstGeom prst="rect"/>
+                    <a:prstGeom prst="rect">
+                      <a:avLst/>
+                    </a:prstGeom>
                   </pic:spPr>
                 </pic:pic>
               </a:graphicData>
@@ -884,7 +1011,14 @@
           <w:i/>
           <w:sz w:val="19"/>
         </w:rPr>
-        <w:t>Figure 3: Residual Error Distribution and Residuals vs. Fitted Values Diagnostics.</w:t>
+        <w:t>Figure 3: Residual Error Distribution and Residuals vs. Fitted Values D</w:t>
+      </w:r>
+      <w:r>
+        <w:rPr>
+          <w:i/>
+          <w:sz w:val="19"/>
+        </w:rPr>
+        <w:t>iagnostics.</w:t>
       </w:r>
     </w:p>
     <w:p>
@@ -894,22 +1028,26 @@
     </w:p>
     <w:p>
       <w:r>
+        <w:rPr>
+          <w:noProof/>
+        </w:rPr>
         <w:drawing>
-          <wp:inline xmlns:a="http://schemas.openxmlformats.org/drawingml/2006/main" xmlns:pic="http://schemas.openxmlformats.org/drawingml/2006/picture">
+          <wp:inline distT="0" distB="0" distL="0" distR="0">
             <wp:extent cx="5303520" cy="2946400"/>
+            <wp:effectExtent l="0" t="0" r="0" b="0"/>
             <wp:docPr id="4" name="Picture 4"/>
             <wp:cNvGraphicFramePr>
-              <a:graphicFrameLocks noChangeAspect="1"/>
+              <a:graphicFrameLocks xmlns:a="http://schemas.openxmlformats.org/drawingml/2006/main" noChangeAspect="1"/>
             </wp:cNvGraphicFramePr>
-            <a:graphic>
+            <a:graphic xmlns:a="http://schemas.openxmlformats.org/drawingml/2006/main">
               <a:graphicData uri="http://schemas.openxmlformats.org/drawingml/2006/picture">
-                <pic:pic>
+                <pic:pic xmlns:pic="http://schemas.openxmlformats.org/drawingml/2006/picture">
                   <pic:nvPicPr>
                     <pic:cNvPr id="0" name="viz_feature_importance.png"/>
                     <pic:cNvPicPr/>
                   </pic:nvPicPr>
                   <pic:blipFill>
-                    <a:blip r:embed="rId12"/>
+                    <a:blip r:embed="rId9"/>
                     <a:stretch>
                       <a:fillRect/>
                     </a:stretch>
@@ -919,7 +1057,9 @@
                       <a:off x="0" y="0"/>
                       <a:ext cx="5303520" cy="2946400"/>
                     </a:xfrm>
-                    <a:prstGeom prst="rect"/>
+                    <a:prstGeom prst="rect">
+                      <a:avLst/>
+                    </a:prstGeom>
                   </pic:spPr>
                 </pic:pic>
               </a:graphicData>
@@ -947,7 +1087,6 @@
       </w:pPr>
       <w:r>
         <w:rPr>
-          <w:b/>
           <w:color w:val="1A5276"/>
           <w:sz w:val="32"/>
         </w:rPr>
@@ -967,10 +1106,23 @@
         <w:rPr>
           <w:b/>
         </w:rPr>
-        <w:t xml:space="preserve">Overfitting vs. Underfitting Dynamics: </w:t>
+        <w:t>Over</w:t>
       </w:r>
       <w:r>
-        <w:t>The single Decision Tree suffered from noticeable high variance (Test R² = 0.721, CV R² = 0.565 ± 0.123), exhibiting overfitting on localized training leaves. In contrast, Random Forest and Gradient Boosting demonstrated lower generalization variance across folds (CV Std ~ 0.051).</w:t>
+        <w:rPr>
+          <w:b/>
+        </w:rPr>
+        <w:t xml:space="preserve">fitting vs. Underfitting Dynamics: </w:t>
+      </w:r>
+      <w:r>
+        <w:t xml:space="preserve">The single Decision Tree suffered from noticeable high variance (Test R² = 0.721, CV R² = 0.565 ± 0.123), exhibiting overfitting on localized training </w:t>
+      </w:r>
+      <w:r>
+        <w:lastRenderedPageBreak/>
+        <w:t xml:space="preserve">leaves. In contrast, Random Forest and Gradient Boosting demonstrated </w:t>
+      </w:r>
+      <w:r>
+        <w:t>lower generalization variance across folds (CV Std ~ 0.051).</w:t>
       </w:r>
     </w:p>
     <w:p>
@@ -984,7 +1136,10 @@
         <w:t xml:space="preserve">Multicollinearity &amp; Feature Redundancy: </w:t>
       </w:r>
       <w:r>
-        <w:t>GDP per capita and Health (Life Expectancy) share strong positive correlation (r &gt; 0.81). While Linear Regression achieves high R² on the test set, coefficient estimates can be volatile without regularization; Ridge Regression proved crucial for coefficient stabilization.</w:t>
+        <w:t>GDP per capita and Health (Life Expectancy) share strong positive correlation (r &gt; 0.81). While Linear Regression achieves high R² on the test set, coeffic</w:t>
+      </w:r>
+      <w:r>
+        <w:t>ient estimates can be volatile without regularization; Ridge Regression proved crucial for coefficient stabilization.</w:t>
       </w:r>
     </w:p>
     <w:p>
@@ -998,7 +1153,10 @@
         <w:t xml:space="preserve">Omitted Variable Bias &amp; Cultural Subjectivity: </w:t>
       </w:r>
       <w:r>
-        <w:t>The residual standard deviation (~0.44 points) underscores that socio-economic indicators alone cannot capture all variance in subjective happiness. Unmeasured factors such as cultural baseline optimism, governance transparency, and inequality indices contribute to unexplained variance (Dystopia Residual).</w:t>
+        <w:t>The residual standard deviation (~0.44 points) underscores that socio-economic indicators a</w:t>
+      </w:r>
+      <w:r>
+        <w:t>lone cannot capture all variance in subjective happiness. Unmeasured factors such as cultural baseline optimism, governance transparency, and inequality indices contribute to unexplained variance (Dystopia Residual).</w:t>
       </w:r>
     </w:p>
     <w:p>
@@ -1009,7 +1167,13 @@
         <w:rPr>
           <w:b/>
         </w:rPr>
-        <w:t xml:space="preserve">Recommendations for Iterative Enhancement: </w:t>
+        <w:t>Recommendations for Iterative Enhanceme</w:t>
+      </w:r>
+      <w:r>
+        <w:rPr>
+          <w:b/>
+        </w:rPr>
+        <w:t xml:space="preserve">nt: </w:t>
       </w:r>
       <w:r>
         <w:t>1) Integrate macro-economic time-series features (e.g., inflation rates, Gini inequality index); 2) Implement Bayesian Hyperparameter Optimization; 3) Apply SHAP (SHapley Additive exPlanations) values for granular country-level explainability.</w:t>
@@ -1018,6 +1182,12 @@
     <w:sectPr>
       <w:pgSz w:w="12240" w:h="15840"/>
       <w:pgMar w:top="1440" w:right="1440" w:bottom="1440" w:left="1440" w:header="720" w:footer="720" w:gutter="0"/>
+      <w:pgBorders w:offsetFrom="page">
+        <w:top w:val="double" w:sz="4" w:space="24" w:color="auto"/>
+        <w:left w:val="double" w:sz="4" w:space="24" w:color="auto"/>
+        <w:bottom w:val="double" w:sz="4" w:space="24" w:color="auto"/>
+        <w:right w:val="double" w:sz="4" w:space="24" w:color="auto"/>
+      </w:pgBorders>
       <w:cols w:space="720"/>
       <w:docGrid w:linePitch="360"/>
     </w:sectPr>
@@ -1026,7 +1196,7 @@
 </file>
 
 <file path=word/numbering.xml><?xml version="1.0" encoding="utf-8"?>
-<w:numbering xmlns:wpc="http://schemas.microsoft.com/office/word/2010/wordprocessingCanvas" xmlns:mo="http://schemas.microsoft.com/office/mac/office/2008/main" xmlns:mc="http://schemas.openxmlformats.org/markup-compatibility/2006" xmlns:mv="urn:schemas-microsoft-com:mac:vml" xmlns:o="urn:schemas-microsoft-com:office:office" xmlns:r="http://schemas.openxmlformats.org/officeDocument/2006/relationships" xmlns:m="http://schemas.openxmlformats.org/officeDocument/2006/math" xmlns:v="urn:schemas-microsoft-com:vml" xmlns:wp14="http://schemas.microsoft.com/office/word/2010/wordprocessingDrawing" xmlns:wp="http://schemas.openxmlformats.org/drawingml/2006/wordprocessingDrawing" xmlns:w10="urn:schemas-microsoft-com:office:word" xmlns:w="http://schemas.openxmlformats.org/wordprocessingml/2006/main" xmlns:w14="http://schemas.microsoft.com/office/word/2010/wordml" xmlns:wpg="http://schemas.microsoft.com/office/word/2010/wordprocessingGroup" xmlns:wpi="http://schemas.microsoft.com/office/word/2010/wordprocessingInk" xmlns:wne="http://schemas.microsoft.com/office/word/2006/wordml" xmlns:wps="http://schemas.microsoft.com/office/word/2010/wordprocessingShape" mc:Ignorable="w14 wp14">
+<w:numbering xmlns:ve="http://schemas.openxmlformats.org/markup-compatibility/2006" xmlns:o="urn:schemas-microsoft-com:office:office" xmlns:r="http://schemas.openxmlformats.org/officeDocument/2006/relationships" xmlns:m="http://schemas.openxmlformats.org/officeDocument/2006/math" xmlns:v="urn:schemas-microsoft-com:vml" xmlns:wp="http://schemas.openxmlformats.org/drawingml/2006/wordprocessingDrawing" xmlns:w10="urn:schemas-microsoft-com:office:word" xmlns:w="http://schemas.openxmlformats.org/wordprocessingml/2006/main" xmlns:wne="http://schemas.microsoft.com/office/word/2006/wordml">
   <w:abstractNum w:abstractNumId="0">
     <w:nsid w:val="FFFFFF7C"/>
     <w:multiLevelType w:val="singleLevel"/>
@@ -1229,7 +1399,7 @@
 </file>
 
 <file path=word/styles.xml><?xml version="1.0" encoding="utf-8"?>
-<w:styles xmlns:mc="http://schemas.openxmlformats.org/markup-compatibility/2006" xmlns:r="http://schemas.openxmlformats.org/officeDocument/2006/relationships" xmlns:w="http://schemas.openxmlformats.org/wordprocessingml/2006/main" xmlns:w14="http://schemas.microsoft.com/office/word/2010/wordml" mc:Ignorable="w14">
+<w:styles xmlns:r="http://schemas.openxmlformats.org/officeDocument/2006/relationships" xmlns:w="http://schemas.openxmlformats.org/wordprocessingml/2006/main">
   <w:docDefaults>
     <w:rPrDefault>
       <w:rPr>
@@ -1245,7 +1415,7 @@
       </w:pPr>
     </w:pPrDefault>
   </w:docDefaults>
-  <w:latentStyles w:defLockedState="0" w:defUIPriority="99" w:defSemiHidden="1" w:defUnhideWhenUsed="1" w:defQFormat="0" w:count="276">
+  <w:latentStyles w:defLockedState="0" w:defUIPriority="99" w:defSemiHidden="1" w:defUnhideWhenUsed="1" w:defQFormat="0" w:count="267">
     <w:lsdException w:name="Normal" w:semiHidden="0" w:uiPriority="0" w:unhideWhenUsed="0" w:qFormat="1"/>
     <w:lsdException w:name="heading 1" w:semiHidden="0" w:uiPriority="9" w:unhideWhenUsed="0" w:qFormat="1"/>
     <w:lsdException w:name="heading 2" w:uiPriority="9" w:qFormat="1"/>
@@ -1389,50 +1559,6 @@
     <w:qFormat/>
     <w:rsid w:val="00FC693F"/>
   </w:style>
-  <w:style w:type="paragraph" w:styleId="Header">
-    <w:name w:val="header"/>
-    <w:basedOn w:val="Normal"/>
-    <w:link w:val="HeaderChar"/>
-    <w:uiPriority w:val="99"/>
-    <w:unhideWhenUsed/>
-    <w:rsid w:val="00E618BF"/>
-    <w:pPr>
-      <w:tabs>
-        <w:tab w:val="center" w:pos="4680"/>
-        <w:tab w:val="right" w:pos="9360"/>
-      </w:tabs>
-      <w:spacing w:after="0" w:line="240" w:lineRule="auto"/>
-    </w:pPr>
-  </w:style>
-  <w:style w:type="character" w:customStyle="1" w:styleId="HeaderChar">
-    <w:name w:val="Header Char"/>
-    <w:basedOn w:val="DefaultParagraphFont"/>
-    <w:link w:val="Header"/>
-    <w:uiPriority w:val="99"/>
-    <w:rsid w:val="00E618BF"/>
-  </w:style>
-  <w:style w:type="paragraph" w:styleId="Footer">
-    <w:name w:val="footer"/>
-    <w:basedOn w:val="Normal"/>
-    <w:link w:val="FooterChar"/>
-    <w:uiPriority w:val="99"/>
-    <w:unhideWhenUsed/>
-    <w:rsid w:val="00E618BF"/>
-    <w:pPr>
-      <w:tabs>
-        <w:tab w:val="center" w:pos="4680"/>
-        <w:tab w:val="right" w:pos="9360"/>
-      </w:tabs>
-      <w:spacing w:after="0" w:line="240" w:lineRule="auto"/>
-    </w:pPr>
-  </w:style>
-  <w:style w:type="character" w:customStyle="1" w:styleId="FooterChar">
-    <w:name w:val="Footer Char"/>
-    <w:basedOn w:val="DefaultParagraphFont"/>
-    <w:link w:val="Footer"/>
-    <w:uiPriority w:val="99"/>
-    <w:rsid w:val="00E618BF"/>
-  </w:style>
   <w:style w:type="paragraph" w:styleId="Heading1">
     <w:name w:val="heading 1"/>
     <w:basedOn w:val="Normal"/>
@@ -1653,6 +1779,7 @@
     <w:uiPriority w:val="99"/>
     <w:semiHidden/>
     <w:unhideWhenUsed/>
+    <w:qFormat/>
     <w:tblPr>
       <w:tblInd w:w="0" w:type="dxa"/>
       <w:tblCellMar>
@@ -1668,6 +1795,50 @@
     <w:uiPriority w:val="99"/>
     <w:semiHidden/>
     <w:unhideWhenUsed/>
+  </w:style>
+  <w:style w:type="paragraph" w:styleId="Header">
+    <w:name w:val="header"/>
+    <w:basedOn w:val="Normal"/>
+    <w:link w:val="HeaderChar"/>
+    <w:uiPriority w:val="99"/>
+    <w:unhideWhenUsed/>
+    <w:rsid w:val="00E618BF"/>
+    <w:pPr>
+      <w:tabs>
+        <w:tab w:val="center" w:pos="4680"/>
+        <w:tab w:val="right" w:pos="9360"/>
+      </w:tabs>
+      <w:spacing w:after="0" w:line="240" w:lineRule="auto"/>
+    </w:pPr>
+  </w:style>
+  <w:style w:type="character" w:customStyle="1" w:styleId="HeaderChar">
+    <w:name w:val="Header Char"/>
+    <w:basedOn w:val="DefaultParagraphFont"/>
+    <w:link w:val="Header"/>
+    <w:uiPriority w:val="99"/>
+    <w:rsid w:val="00E618BF"/>
+  </w:style>
+  <w:style w:type="paragraph" w:styleId="Footer">
+    <w:name w:val="footer"/>
+    <w:basedOn w:val="Normal"/>
+    <w:link w:val="FooterChar"/>
+    <w:uiPriority w:val="99"/>
+    <w:unhideWhenUsed/>
+    <w:rsid w:val="00E618BF"/>
+    <w:pPr>
+      <w:tabs>
+        <w:tab w:val="center" w:pos="4680"/>
+        <w:tab w:val="right" w:pos="9360"/>
+      </w:tabs>
+      <w:spacing w:after="0" w:line="240" w:lineRule="auto"/>
+    </w:pPr>
+  </w:style>
+  <w:style w:type="character" w:customStyle="1" w:styleId="FooterChar">
+    <w:name w:val="Footer Char"/>
+    <w:basedOn w:val="DefaultParagraphFont"/>
+    <w:link w:val="Footer"/>
+    <w:uiPriority w:val="99"/>
+    <w:rsid w:val="00E618BF"/>
   </w:style>
   <w:style w:type="paragraph" w:styleId="NoSpacing">
     <w:name w:val="No Spacing"/>
@@ -13070,6 +13241,36 @@
         <w:shd w:val="clear" w:color="auto" w:fill="FBCAA2" w:themeFill="accent6" w:themeFillTint="7F"/>
       </w:tcPr>
     </w:tblStylePr>
+  </w:style>
+  <w:style w:type="paragraph" w:styleId="BalloonText">
+    <w:name w:val="Balloon Text"/>
+    <w:basedOn w:val="Normal"/>
+    <w:link w:val="BalloonTextChar"/>
+    <w:uiPriority w:val="99"/>
+    <w:semiHidden/>
+    <w:unhideWhenUsed/>
+    <w:rsid w:val="00154298"/>
+    <w:pPr>
+      <w:spacing w:after="0" w:line="240" w:lineRule="auto"/>
+    </w:pPr>
+    <w:rPr>
+      <w:rFonts w:ascii="Tahoma" w:hAnsi="Tahoma" w:cs="Tahoma"/>
+      <w:sz w:val="16"/>
+      <w:szCs w:val="16"/>
+    </w:rPr>
+  </w:style>
+  <w:style w:type="character" w:customStyle="1" w:styleId="BalloonTextChar">
+    <w:name w:val="Balloon Text Char"/>
+    <w:basedOn w:val="DefaultParagraphFont"/>
+    <w:link w:val="BalloonText"/>
+    <w:uiPriority w:val="99"/>
+    <w:semiHidden/>
+    <w:rsid w:val="00154298"/>
+    <w:rPr>
+      <w:rFonts w:ascii="Tahoma" w:hAnsi="Tahoma" w:cs="Tahoma"/>
+      <w:sz w:val="16"/>
+      <w:szCs w:val="16"/>
+    </w:rPr>
   </w:style>
 </w:styles>
 </file>

</xml_diff>